<commit_message>
Swap in the new CV files and update the contact number
Replace both downloadable CVs with the latest versions authored outside
the repo: the PDF (one page, A4) and the Word .docx that Google Docs
opens. cv.html's mirrored content already matched the new CV, so the
page needed no other edits.

Also update the phone number on cv.html to +1 305-482-6440, in both the
tel: link and the visible text. It was the last place the old number
appeared anywhere in the repo.

Co-Authored-By: Claude Code <noreply@anthropic.com>
</commit_message>
<xml_diff>
--- a/assets/Alper-Kulturel-CV.docx
+++ b/assets/Alper-Kulturel-CV.docx
@@ -44,7 +44,26 @@
           <w:szCs w:val="20"/>
           <w:rtl w:val="0"/>
         </w:rPr>
-        <w:t xml:space="preserve">Miami Beach, Florida | +1 805-471-4461 | kulturelalper@gmail.com</w:t>
+        <w:t xml:space="preserve">Miami Beach, Florida | +1 </w:t>
+      </w:r>
+      <w:r>
+        <w:rPr>
+          <w:rtl w:val="0"/>
+        </w:rPr>
+        <w:t xml:space="preserve">305-482-6440</w:t>
+      </w:r>
+      <w:r>
+        <w:rPr>
+          <w:rFonts w:ascii="Times New Roman" w:cs="Times New Roman" w:eastAsia="Times New Roman" w:hAnsi="Times New Roman"/>
+          <w:b w:val="0"/>
+          <w:bCs w:val="0"/>
+          <w:i w:val="0"/>
+          <w:iCs w:val="0"/>
+          <w:sz w:val="20"/>
+          <w:szCs w:val="20"/>
+          <w:rtl w:val="0"/>
+        </w:rPr>
+        <w:t xml:space="preserve"> | kulturelalper@gmail.com</w:t>
       </w:r>
       <w:r>
         <w:rPr>

</xml_diff>